<commit_message>
Actualizar documento de proyecto ALPA con correcciones
</commit_message>
<xml_diff>
--- a/scratch/ALPA_Documento_Proyecto.docx
+++ b/scratch/ALPA_Documento_Proyecto.docx
@@ -241,35 +241,55 @@
         <w:rPr>
           <w:lang w:val="es-AR"/>
         </w:rPr>
-        <w:t xml:space="preserve">ALPA es un sistema autónomo de detección temprana de incendios rurales diseñado para zonas sin conectividad celular ni red eléctrica. Consiste en un kit de sensores que se instala en postes en el perímetro del campo, se comunica por radio </w:t>
-      </w:r>
-      <w:proofErr w:type="spellStart"/>
-      <w:r>
-        <w:rPr>
-          <w:lang w:val="es-AR"/>
-        </w:rPr>
-        <w:t>LoRa</w:t>
-      </w:r>
-      <w:proofErr w:type="spellEnd"/>
-      <w:r>
-        <w:rPr>
-          <w:lang w:val="es-AR"/>
-        </w:rPr>
-        <w:t xml:space="preserve"> hasta un punto de salida con internet, y envía alertas en tiempo real a un </w:t>
-      </w:r>
-      <w:proofErr w:type="spellStart"/>
-      <w:r>
-        <w:rPr>
-          <w:lang w:val="es-AR"/>
-        </w:rPr>
-        <w:t>dashboard</w:t>
-      </w:r>
-      <w:proofErr w:type="spellEnd"/>
-      <w:r>
-        <w:rPr>
-          <w:lang w:val="es-AR"/>
-        </w:rPr>
-        <w:t xml:space="preserve"> web. No necesita señal, no necesita electricidad, no necesita un técnico que lo instale. Detecta signos de incendio cuando el fuego recién comienza, todavía controlable.</w:t>
+        <w:t xml:space="preserve">ALPA es un sistema autónomo de detección temprana de incendios rurales diseñado para zonas sin conectividad celular ni red eléctrica. Consiste en un kit de sensores que se instala en </w:t>
+      </w:r>
+      <w:r>
+        <w:rPr>
+          <w:lang w:val="es-AR"/>
+        </w:rPr>
+        <w:t xml:space="preserve">el </w:t>
+      </w:r>
+      <w:r>
+        <w:rPr>
+          <w:lang w:val="es-AR"/>
+        </w:rPr>
+        <w:t>perímetro del campo, se comunica hasta un punto de salida con internet, y envía alertas en tiempo real a</w:t>
+      </w:r>
+      <w:r>
+        <w:rPr>
+          <w:lang w:val="es-AR"/>
+        </w:rPr>
+        <w:t xml:space="preserve">l productor. </w:t>
+      </w:r>
+      <w:r>
+        <w:rPr>
+          <w:lang w:val="es-AR"/>
+        </w:rPr>
+        <w:t xml:space="preserve">No necesita señal, no necesita electricidad, no necesita un técnico que lo instale. Detecta </w:t>
+      </w:r>
+      <w:r>
+        <w:rPr>
+          <w:lang w:val="es-AR"/>
+        </w:rPr>
+        <w:t xml:space="preserve">señales </w:t>
+      </w:r>
+      <w:r>
+        <w:rPr>
+          <w:lang w:val="es-AR"/>
+        </w:rPr>
+        <w:t>de incendio cuando el fuego recién comienza</w:t>
+      </w:r>
+      <w:r>
+        <w:rPr>
+          <w:lang w:val="es-AR"/>
+        </w:rPr>
+        <w:t xml:space="preserve"> y todavía es controlable</w:t>
+      </w:r>
+      <w:r>
+        <w:rPr>
+          <w:lang w:val="es-AR"/>
+        </w:rPr>
+        <w:t>.</w:t>
       </w:r>
     </w:p>
     <w:p>
@@ -365,21 +385,7 @@
         <w:rPr>
           <w:lang w:val="es-AR"/>
         </w:rPr>
-        <w:t xml:space="preserve"> </w:t>
-      </w:r>
-      <w:proofErr w:type="gramStart"/>
-      <w:r>
-        <w:rPr>
-          <w:lang w:val="es-AR"/>
-        </w:rPr>
-        <w:t>efectivas</w:t>
-      </w:r>
-      <w:proofErr w:type="gramEnd"/>
-      <w:r>
-        <w:rPr>
-          <w:lang w:val="es-AR"/>
-        </w:rPr>
-        <w:t xml:space="preserve"> pero cuestan USD 500.000 por unidad. </w:t>
+        <w:t xml:space="preserve"> efectivas pero cuestan USD 500.000 por unidad. </w:t>
       </w:r>
       <w:proofErr w:type="spellStart"/>
       <w:r>
@@ -2058,20 +2064,6 @@
     </w:p>
     <w:p>
       <w:pPr>
-        <w:rPr>
-          <w:lang w:val="es-AR"/>
-        </w:rPr>
-      </w:pPr>
-    </w:p>
-    <w:p>
-      <w:pPr>
-        <w:rPr>
-          <w:lang w:val="es-AR"/>
-        </w:rPr>
-      </w:pPr>
-    </w:p>
-    <w:p>
-      <w:pPr>
         <w:spacing w:before="200" w:after="80"/>
         <w:rPr>
           <w:lang w:val="es-AR"/>
@@ -2084,6 +2076,7 @@
           <w:sz w:val="36"/>
           <w:lang w:val="es-AR"/>
         </w:rPr>
+        <w:lastRenderedPageBreak/>
         <w:t>Estado Actual</w:t>
       </w:r>
     </w:p>
@@ -2629,7 +2622,13 @@
         <w:rPr>
           <w:lang w:val="es-AR"/>
         </w:rPr>
-        <w:t xml:space="preserve">Respaldados por la Secretaría de Ciencia y Tecnología </w:t>
+        <w:t>, r</w:t>
+      </w:r>
+      <w:r>
+        <w:rPr>
+          <w:lang w:val="es-AR"/>
+        </w:rPr>
+        <w:t xml:space="preserve">espaldados por la Secretaría de Ciencia y Tecnología </w:t>
       </w:r>
       <w:r>
         <w:rPr>

</xml_diff>